<commit_message>
ADD qcm 2023 et cours sql
</commit_message>
<xml_diff>
--- a/DELETE ME/UML.docx
+++ b/DELETE ME/UML.docx
@@ -92,7 +92,7 @@
     <w:p>
       <w:r>
         <w:pict w14:anchorId="1347EC83">
-          <v:rect id="_x0000_i1079" style="width:0;height:1.5pt" o:hralign="center" o:hrstd="t" o:hr="t" fillcolor="#a0a0a0" stroked="f"/>
+          <v:rect id="_x0000_i1025" style="width:0;height:1.5pt" o:hralign="center" o:hrstd="t" o:hr="t" fillcolor="#a0a0a0" stroked="f"/>
         </w:pict>
       </w:r>
     </w:p>
@@ -165,7 +165,7 @@
     <w:p>
       <w:r>
         <w:pict w14:anchorId="494907ED">
-          <v:rect id="_x0000_i1080" style="width:0;height:1.5pt" o:hralign="center" o:hrstd="t" o:hr="t" fillcolor="#a0a0a0" stroked="f"/>
+          <v:rect id="_x0000_i1026" style="width:0;height:1.5pt" o:hralign="center" o:hrstd="t" o:hr="t" fillcolor="#a0a0a0" stroked="f"/>
         </w:pict>
       </w:r>
     </w:p>
@@ -200,7 +200,7 @@
     <w:p>
       <w:r>
         <w:pict w14:anchorId="11C1DAA1">
-          <v:rect id="_x0000_i1081" style="width:0;height:1.5pt" o:hralign="center" o:hrstd="t" o:hr="t" fillcolor="#a0a0a0" stroked="f"/>
+          <v:rect id="_x0000_i1027" style="width:0;height:1.5pt" o:hralign="center" o:hrstd="t" o:hr="t" fillcolor="#a0a0a0" stroked="f"/>
         </w:pict>
       </w:r>
     </w:p>
@@ -235,7 +235,7 @@
     <w:p>
       <w:r>
         <w:pict w14:anchorId="54ED098F">
-          <v:rect id="_x0000_i1082" style="width:0;height:1.5pt" o:hralign="center" o:hrstd="t" o:hr="t" fillcolor="#a0a0a0" stroked="f"/>
+          <v:rect id="_x0000_i1028" style="width:0;height:1.5pt" o:hralign="center" o:hrstd="t" o:hr="t" fillcolor="#a0a0a0" stroked="f"/>
         </w:pict>
       </w:r>
     </w:p>
@@ -270,7 +270,7 @@
     <w:p>
       <w:r>
         <w:pict w14:anchorId="2494A032">
-          <v:rect id="_x0000_i1083" style="width:0;height:1.5pt" o:hralign="center" o:hrstd="t" o:hr="t" fillcolor="#a0a0a0" stroked="f"/>
+          <v:rect id="_x0000_i1029" style="width:0;height:1.5pt" o:hralign="center" o:hrstd="t" o:hr="t" fillcolor="#a0a0a0" stroked="f"/>
         </w:pict>
       </w:r>
     </w:p>
@@ -305,7 +305,7 @@
     <w:p>
       <w:r>
         <w:pict w14:anchorId="74D2718E">
-          <v:rect id="_x0000_i1084" style="width:0;height:1.5pt" o:hralign="center" o:hrstd="t" o:hr="t" fillcolor="#a0a0a0" stroked="f"/>
+          <v:rect id="_x0000_i1030" style="width:0;height:1.5pt" o:hralign="center" o:hrstd="t" o:hr="t" fillcolor="#a0a0a0" stroked="f"/>
         </w:pict>
       </w:r>
     </w:p>
@@ -383,7 +383,7 @@
     <w:p>
       <w:r>
         <w:pict w14:anchorId="485B5B28">
-          <v:rect id="_x0000_i1085" style="width:0;height:1.5pt" o:hralign="center" o:hrstd="t" o:hr="t" fillcolor="#a0a0a0" stroked="f"/>
+          <v:rect id="_x0000_i1031" style="width:0;height:1.5pt" o:hralign="center" o:hrstd="t" o:hr="t" fillcolor="#a0a0a0" stroked="f"/>
         </w:pict>
       </w:r>
     </w:p>
@@ -418,7 +418,7 @@
     <w:p>
       <w:r>
         <w:pict w14:anchorId="73C4F00F">
-          <v:rect id="_x0000_i1086" style="width:0;height:1.5pt" o:hralign="center" o:hrstd="t" o:hr="t" fillcolor="#a0a0a0" stroked="f"/>
+          <v:rect id="_x0000_i1032" style="width:0;height:1.5pt" o:hralign="center" o:hrstd="t" o:hr="t" fillcolor="#a0a0a0" stroked="f"/>
         </w:pict>
       </w:r>
     </w:p>
@@ -453,7 +453,7 @@
     <w:p>
       <w:r>
         <w:pict w14:anchorId="653A6A2E">
-          <v:rect id="_x0000_i1087" style="width:0;height:1.5pt" o:hralign="center" o:hrstd="t" o:hr="t" fillcolor="#a0a0a0" stroked="f"/>
+          <v:rect id="_x0000_i1033" style="width:0;height:1.5pt" o:hralign="center" o:hrstd="t" o:hr="t" fillcolor="#a0a0a0" stroked="f"/>
         </w:pict>
       </w:r>
     </w:p>
@@ -1137,6 +1137,7 @@
   <w:style w:type="character" w:default="1" w:styleId="Policepardfaut">
     <w:name w:val="Default Paragraph Font"/>
     <w:uiPriority w:val="1"/>
+    <w:semiHidden/>
     <w:unhideWhenUsed/>
   </w:style>
   <w:style w:type="table" w:default="1" w:styleId="TableauNormal">

</xml_diff>